<commit_message>
修改Tomcat thread pool vs DB connection thread實驗
</commit_message>
<xml_diff>
--- a/Tomcat thread pool vs DB connection thread實驗.docx
+++ b/Tomcat thread pool vs DB connection thread實驗.docx
@@ -20,16 +20,8 @@
         <w:rPr>
           <w:rFonts w:hint="eastAsia"/>
         </w:rPr>
-        <w:t>觀察有</w:t>
-      </w:r>
-      <w:proofErr w:type="gramStart"/>
-      <w:r>
-        <w:rPr>
-          <w:rFonts w:hint="eastAsia"/>
-        </w:rPr>
-        <w:t>多少的</w:t>
-      </w:r>
-      <w:proofErr w:type="gramEnd"/>
+        <w:t>觀察有多少的</w:t>
+      </w:r>
       <w:r>
         <w:rPr>
           <w:rFonts w:hint="eastAsia"/>
@@ -58,16 +50,8 @@
         <w:rPr>
           <w:rFonts w:hint="eastAsia"/>
         </w:rPr>
-        <w:t>觀察有</w:t>
-      </w:r>
-      <w:proofErr w:type="gramStart"/>
-      <w:r>
-        <w:rPr>
-          <w:rFonts w:hint="eastAsia"/>
-        </w:rPr>
-        <w:t>多少的</w:t>
-      </w:r>
-      <w:proofErr w:type="gramEnd"/>
+        <w:t>觀察有多少的</w:t>
+      </w:r>
       <w:r>
         <w:rPr>
           <w:rFonts w:hint="eastAsia"/>
@@ -143,21 +127,7 @@
         <w:rPr>
           <w:rFonts w:hint="eastAsia"/>
         </w:rPr>
-        <w:t>，用</w:t>
-      </w:r>
-      <w:proofErr w:type="gramStart"/>
-      <w:r>
-        <w:rPr>
-          <w:rFonts w:hint="eastAsia"/>
-        </w:rPr>
-        <w:t>悲觀鎖做</w:t>
-      </w:r>
-      <w:proofErr w:type="gramEnd"/>
-      <w:r>
-        <w:rPr>
-          <w:rFonts w:hint="eastAsia"/>
-        </w:rPr>
-        <w:t>，避免樂觀鎖的</w:t>
+        <w:t>，用悲觀鎖做，避免樂觀鎖的</w:t>
       </w:r>
       <w:r>
         <w:rPr>
@@ -208,22 +178,173 @@
         </w:rPr>
         <w:t>，</w:t>
       </w:r>
-      <w:proofErr w:type="spellStart"/>
-      <w:r>
-        <w:t>omcat</w:t>
-      </w:r>
-      <w:proofErr w:type="spellEnd"/>
+      <w:r>
+        <w:t>omcat threads.max = 100</w:t>
+      </w:r>
+      <w:r>
+        <w:rPr>
+          <w:rFonts w:hint="eastAsia"/>
+        </w:rPr>
+        <w:t>，</w:t>
+      </w:r>
+      <w:r>
+        <w:t>Hikari maximum-pool-size = 10</w:t>
+      </w:r>
+    </w:p>
+    <w:p>
+      <w:r>
+        <w:rPr>
+          <w:rFonts w:hint="eastAsia"/>
+        </w:rPr>
+        <w:t>第二個為</w:t>
+      </w:r>
+      <w:r>
+        <w:rPr>
+          <w:rFonts w:hint="eastAsia"/>
+        </w:rPr>
+        <w:t>驗證</w:t>
+      </w:r>
+      <w:r>
+        <w:t>DB connection pool</w:t>
+      </w:r>
+      <w:r>
+        <w:rPr>
+          <w:rFonts w:hint="eastAsia"/>
+        </w:rPr>
+        <w:t>縮</w:t>
+      </w:r>
+      <w:r>
+        <w:rPr>
+          <w:rFonts w:hint="eastAsia"/>
+        </w:rPr>
+        <w:t>小，是否會產生</w:t>
+      </w:r>
+      <w:r>
+        <w:rPr>
+          <w:rFonts w:hint="eastAsia"/>
+        </w:rPr>
+        <w:t>bottleneck</w:t>
+      </w:r>
+      <w:r>
+        <w:rPr>
+          <w:rFonts w:hint="eastAsia"/>
+        </w:rPr>
+        <w:t>，</w:t>
+      </w:r>
+      <w:r>
+        <w:t>Tomcat threads.max = 100</w:t>
+      </w:r>
+      <w:r>
+        <w:rPr>
+          <w:rFonts w:hint="eastAsia"/>
+        </w:rPr>
+        <w:t>，</w:t>
+      </w:r>
+      <w:r>
+        <w:t xml:space="preserve">Hikari maximum-pool-size = 3 </w:t>
+      </w:r>
+    </w:p>
+    <w:p>
+      <w:r>
+        <w:rPr>
+          <w:rFonts w:hint="eastAsia"/>
+        </w:rPr>
+        <w:t>第三個為</w:t>
+      </w:r>
+      <w:r>
+        <w:t xml:space="preserve">Tomcat threads </w:t>
+      </w:r>
+      <w:r>
+        <w:t>調大，</w:t>
+      </w:r>
+      <w:r>
+        <w:rPr>
+          <w:rFonts w:hint="eastAsia"/>
+        </w:rPr>
+        <w:t>觀察在</w:t>
+      </w:r>
+      <w:r>
+        <w:rPr>
+          <w:rFonts w:hint="eastAsia"/>
+        </w:rPr>
+        <w:t>DB connection pool</w:t>
+      </w:r>
+      <w:r>
+        <w:rPr>
+          <w:rFonts w:hint="eastAsia"/>
+        </w:rPr>
+        <w:t>不更動，是否效能必更好</w:t>
+      </w:r>
+      <w:r>
+        <w:rPr>
+          <w:rFonts w:hint="eastAsia"/>
+        </w:rPr>
+        <w:t>，</w:t>
+      </w:r>
+      <w:r>
+        <w:t>Tomcat threads.max = 300</w:t>
+      </w:r>
+      <w:r>
+        <w:rPr>
+          <w:rFonts w:hint="eastAsia"/>
+        </w:rPr>
+        <w:t>，</w:t>
+      </w:r>
+      <w:r>
+        <w:t>Hikari maximum-pool-size = 10</w:t>
+      </w:r>
+    </w:p>
+    <w:p>
+      <w:r>
+        <w:rPr>
+          <w:rFonts w:hint="eastAsia"/>
+        </w:rPr>
+        <w:t>預設結論</w:t>
+      </w:r>
+      <w:r>
+        <w:rPr>
+          <w:rFonts w:hint="eastAsia"/>
+        </w:rPr>
+        <w:t>(</w:t>
+      </w:r>
+      <w:r>
+        <w:rPr>
+          <w:rFonts w:hint="eastAsia"/>
+        </w:rPr>
+        <w:t>測試前的判斷</w:t>
+      </w:r>
+      <w:r>
+        <w:rPr>
+          <w:rFonts w:hint="eastAsia"/>
+        </w:rPr>
+        <w:t>)</w:t>
+      </w:r>
+      <w:r>
+        <w:rPr>
+          <w:rFonts w:hint="eastAsia"/>
+        </w:rPr>
+        <w:t>：</w:t>
+      </w:r>
+    </w:p>
+    <w:p>
+      <w:r>
+        <w:rPr>
+          <w:rFonts w:hint="eastAsia"/>
+        </w:rPr>
+        <w:t>第一個實驗</w:t>
+      </w:r>
+      <w:r>
+        <w:rPr>
+          <w:rFonts w:hint="eastAsia"/>
+        </w:rPr>
+        <w:t>為</w:t>
+      </w:r>
+      <w:r>
+        <w:t>系統可正常完成請求</w:t>
+      </w:r>
       <w:r>
         <w:t xml:space="preserve"> </w:t>
       </w:r>
-      <w:proofErr w:type="spellStart"/>
-      <w:r>
-        <w:t>threads.max</w:t>
-      </w:r>
-      <w:proofErr w:type="spellEnd"/>
-      <w:r>
-        <w:t xml:space="preserve"> = 100</w:t>
-      </w:r>
       <w:r>
         <w:rPr>
           <w:rFonts w:hint="eastAsia"/>
@@ -231,35 +352,234 @@
         <w:t>，</w:t>
       </w:r>
       <w:r>
-        <w:t>Hikari maximum-pool-size = 10</w:t>
-      </w:r>
-    </w:p>
-    <w:p>
-      <w:r>
-        <w:rPr>
-          <w:rFonts w:hint="eastAsia"/>
-        </w:rPr>
-        <w:t>第二</w:t>
-      </w:r>
-      <w:proofErr w:type="gramStart"/>
-      <w:r>
-        <w:rPr>
-          <w:rFonts w:hint="eastAsia"/>
-        </w:rPr>
-        <w:t>個</w:t>
-      </w:r>
-      <w:proofErr w:type="gramEnd"/>
-      <w:r>
-        <w:rPr>
-          <w:rFonts w:hint="eastAsia"/>
-        </w:rPr>
-        <w:t>為</w:t>
-      </w:r>
-      <w:r>
-        <w:rPr>
-          <w:rFonts w:hint="eastAsia"/>
-        </w:rPr>
-        <w:t>驗證</w:t>
+        <w:t xml:space="preserve">hikaricp.connections.active </w:t>
+      </w:r>
+      <w:r>
+        <w:t>接近</w:t>
+      </w:r>
+      <w:r>
+        <w:t xml:space="preserve"> 10 </w:t>
+      </w:r>
+      <w:r>
+        <w:rPr>
+          <w:rFonts w:hint="eastAsia"/>
+        </w:rPr>
+        <w:t>，</w:t>
+      </w:r>
+      <w:r>
+        <w:t>hikaricp.connections.pending</w:t>
+      </w:r>
+      <w:r>
+        <w:rPr>
+          <w:rFonts w:hint="eastAsia"/>
+        </w:rPr>
+        <w:t>，</w:t>
+      </w:r>
+      <w:r>
+        <w:t>可能出現少量等待</w:t>
+      </w:r>
+      <w:r>
+        <w:rPr>
+          <w:rFonts w:hint="eastAsia"/>
+        </w:rPr>
+        <w:t>，</w:t>
+      </w:r>
+      <w:r>
+        <w:t>作為後續實驗比較基準</w:t>
+      </w:r>
+    </w:p>
+    <w:p>
+      <w:r>
+        <w:t>實驗二</w:t>
+      </w:r>
+      <w:r>
+        <w:t xml:space="preserve"> DB Connection Pool </w:t>
+      </w:r>
+      <w:r>
+        <w:t>縮小</w:t>
+      </w:r>
+      <w:r>
+        <w:rPr>
+          <w:rFonts w:hint="eastAsia"/>
+        </w:rPr>
+        <w:t>，預期會</w:t>
+      </w:r>
+      <w:r>
+        <w:t xml:space="preserve">hikaricp.connections.active </w:t>
+      </w:r>
+      <w:r>
+        <w:t>接近</w:t>
+      </w:r>
+      <w:r>
+        <w:t xml:space="preserve"> 3</w:t>
+      </w:r>
+      <w:r>
+        <w:rPr>
+          <w:rFonts w:hint="eastAsia"/>
+        </w:rPr>
+        <w:t>，</w:t>
+      </w:r>
+      <w:r>
+        <w:t xml:space="preserve">hikaricp.connections.pending </w:t>
+      </w:r>
+      <w:r>
+        <w:t>明顯增加</w:t>
+      </w:r>
+      <w:r>
+        <w:rPr>
+          <w:rFonts w:hint="eastAsia"/>
+        </w:rPr>
+        <w:t>，</w:t>
+      </w:r>
+      <w:r>
+        <w:t xml:space="preserve">Throughput </w:t>
+      </w:r>
+      <w:r>
+        <w:t>下降或持平</w:t>
+      </w:r>
+      <w:r>
+        <w:rPr>
+          <w:rFonts w:hint="eastAsia"/>
+        </w:rPr>
+        <w:t>，</w:t>
+      </w:r>
+      <w:r>
+        <w:t xml:space="preserve">DB Connection Pool </w:t>
+      </w:r>
+      <w:r>
+        <w:t>成為主要瓶頸</w:t>
+      </w:r>
+      <w:r>
+        <w:rPr>
+          <w:rFonts w:hint="eastAsia"/>
+        </w:rPr>
+        <w:t>。</w:t>
+      </w:r>
+    </w:p>
+    <w:p>
+      <w:r>
+        <w:t>實驗三</w:t>
+      </w:r>
+      <w:r>
+        <w:t xml:space="preserve"> Tomcat Thread Pool </w:t>
+      </w:r>
+      <w:r>
+        <w:t>調大更多</w:t>
+      </w:r>
+      <w:r>
+        <w:t xml:space="preserve"> request </w:t>
+      </w:r>
+      <w:r>
+        <w:t>可以同時進入</w:t>
+      </w:r>
+      <w:r>
+        <w:t xml:space="preserve"> applicatio</w:t>
+      </w:r>
+      <w:r>
+        <w:rPr>
+          <w:rFonts w:hint="eastAsia"/>
+        </w:rPr>
+        <w:t>n</w:t>
+      </w:r>
+      <w:r>
+        <w:rPr>
+          <w:rFonts w:hint="eastAsia"/>
+        </w:rPr>
+        <w:t>，</w:t>
+      </w:r>
+      <w:r>
+        <w:t xml:space="preserve">hikaricp.connections.active </w:t>
+      </w:r>
+      <w:r>
+        <w:rPr>
+          <w:rFonts w:hint="eastAsia"/>
+        </w:rPr>
+        <w:t>會</w:t>
+      </w:r>
+      <w:r>
+        <w:t>接近</w:t>
+      </w:r>
+      <w:r>
+        <w:t xml:space="preserve"> 10</w:t>
+      </w:r>
+      <w:r>
+        <w:rPr>
+          <w:rFonts w:hint="eastAsia"/>
+        </w:rPr>
+        <w:t>，</w:t>
+      </w:r>
+      <w:r>
+        <w:t xml:space="preserve">hikaricp.connections.pending </w:t>
+      </w:r>
+      <w:r>
+        <w:rPr>
+          <w:rFonts w:hint="eastAsia"/>
+        </w:rPr>
+        <w:t>會快速</w:t>
+      </w:r>
+      <w:r>
+        <w:rPr>
+          <w:rFonts w:hint="eastAsia"/>
+        </w:rPr>
+        <w:t>增加</w:t>
+      </w:r>
+      <w:r>
+        <w:rPr>
+          <w:rFonts w:hint="eastAsia"/>
+        </w:rPr>
+        <w:t>，</w:t>
+      </w:r>
+      <w:r>
+        <w:rPr>
+          <w:rFonts w:hint="eastAsia"/>
+        </w:rPr>
+        <w:t>如果</w:t>
+      </w:r>
+      <w:r>
+        <w:t xml:space="preserve">DB Pool </w:t>
+      </w:r>
+      <w:r>
+        <w:t>不變，單純增加</w:t>
+      </w:r>
+      <w:r>
+        <w:t xml:space="preserve"> Tomcat Thread </w:t>
+      </w:r>
+      <w:r>
+        <w:t>無法突破資料庫瓶頸</w:t>
+      </w:r>
+      <w:r>
+        <w:rPr>
+          <w:rFonts w:hint="eastAsia"/>
+        </w:rPr>
+        <w:t>。</w:t>
+      </w:r>
+    </w:p>
+    <w:p>
+      <w:r>
+        <w:rPr>
+          <w:rFonts w:hint="eastAsia"/>
+        </w:rPr>
+        <w:t>結論</w:t>
+      </w:r>
+      <w:r>
+        <w:rPr>
+          <w:rFonts w:hint="eastAsia"/>
+        </w:rPr>
+        <w:t>：</w:t>
+      </w:r>
+    </w:p>
+    <w:p>
+      <w:r>
+        <w:rPr>
+          <w:rFonts w:hint="eastAsia"/>
+        </w:rPr>
+        <w:t>(</w:t>
+      </w:r>
+      <w:r>
+        <w:rPr>
+          <w:rFonts w:hint="eastAsia"/>
+        </w:rPr>
+        <w:t>在第二個</w:t>
       </w:r>
       <w:r>
         <w:t>DB connection pool</w:t>
@@ -268,19 +588,16 @@
         <w:rPr>
           <w:rFonts w:hint="eastAsia"/>
         </w:rPr>
-        <w:t>縮</w:t>
-      </w:r>
-      <w:r>
-        <w:rPr>
-          <w:rFonts w:hint="eastAsia"/>
-        </w:rPr>
-        <w:t>小，是否會產生</w:t>
-      </w:r>
-      <w:r>
-        <w:rPr>
-          <w:rFonts w:hint="eastAsia"/>
-        </w:rPr>
-        <w:t>bottleneck</w:t>
+        <w:t>縮小</w:t>
+      </w:r>
+      <w:r>
+        <w:rPr>
+          <w:rFonts w:hint="eastAsia"/>
+        </w:rPr>
+        <w:t>的實驗中，</w:t>
+      </w:r>
+      <w:r>
+        <w:t>active = 3</w:t>
       </w:r>
       <w:r>
         <w:rPr>
@@ -289,458 +606,6 @@
         <w:t>，</w:t>
       </w:r>
       <w:r>
-        <w:t xml:space="preserve">Tomcat </w:t>
-      </w:r>
-      <w:proofErr w:type="spellStart"/>
-      <w:r>
-        <w:t>threads.max</w:t>
-      </w:r>
-      <w:proofErr w:type="spellEnd"/>
-      <w:r>
-        <w:t xml:space="preserve"> = 100</w:t>
-      </w:r>
-      <w:r>
-        <w:rPr>
-          <w:rFonts w:hint="eastAsia"/>
-        </w:rPr>
-        <w:t>，</w:t>
-      </w:r>
-      <w:r>
-        <w:t xml:space="preserve">Hikari maximum-pool-size = 3 </w:t>
-      </w:r>
-    </w:p>
-    <w:p>
-      <w:r>
-        <w:rPr>
-          <w:rFonts w:hint="eastAsia"/>
-        </w:rPr>
-        <w:t>第三</w:t>
-      </w:r>
-      <w:proofErr w:type="gramStart"/>
-      <w:r>
-        <w:rPr>
-          <w:rFonts w:hint="eastAsia"/>
-        </w:rPr>
-        <w:t>個</w:t>
-      </w:r>
-      <w:proofErr w:type="gramEnd"/>
-      <w:r>
-        <w:rPr>
-          <w:rFonts w:hint="eastAsia"/>
-        </w:rPr>
-        <w:t>為</w:t>
-      </w:r>
-      <w:r>
-        <w:t xml:space="preserve">Tomcat threads </w:t>
-      </w:r>
-      <w:r>
-        <w:t>調大，</w:t>
-      </w:r>
-      <w:r>
-        <w:rPr>
-          <w:rFonts w:hint="eastAsia"/>
-        </w:rPr>
-        <w:t>觀察在</w:t>
-      </w:r>
-      <w:r>
-        <w:rPr>
-          <w:rFonts w:hint="eastAsia"/>
-        </w:rPr>
-        <w:t>DB connection pool</w:t>
-      </w:r>
-      <w:proofErr w:type="gramStart"/>
-      <w:r>
-        <w:rPr>
-          <w:rFonts w:hint="eastAsia"/>
-        </w:rPr>
-        <w:t>不</w:t>
-      </w:r>
-      <w:proofErr w:type="gramEnd"/>
-      <w:r>
-        <w:rPr>
-          <w:rFonts w:hint="eastAsia"/>
-        </w:rPr>
-        <w:t>更動，是否效能必更好</w:t>
-      </w:r>
-      <w:r>
-        <w:rPr>
-          <w:rFonts w:hint="eastAsia"/>
-        </w:rPr>
-        <w:t>，</w:t>
-      </w:r>
-      <w:r>
-        <w:t xml:space="preserve">Tomcat </w:t>
-      </w:r>
-      <w:proofErr w:type="spellStart"/>
-      <w:r>
-        <w:t>threads.max</w:t>
-      </w:r>
-      <w:proofErr w:type="spellEnd"/>
-      <w:r>
-        <w:t xml:space="preserve"> = 300</w:t>
-      </w:r>
-      <w:r>
-        <w:rPr>
-          <w:rFonts w:hint="eastAsia"/>
-        </w:rPr>
-        <w:t>，</w:t>
-      </w:r>
-      <w:r>
-        <w:t>Hikari maximum-pool-size = 10</w:t>
-      </w:r>
-    </w:p>
-    <w:p>
-      <w:r>
-        <w:rPr>
-          <w:rFonts w:hint="eastAsia"/>
-        </w:rPr>
-        <w:t>預設結論</w:t>
-      </w:r>
-      <w:r>
-        <w:rPr>
-          <w:rFonts w:hint="eastAsia"/>
-        </w:rPr>
-        <w:t>(</w:t>
-      </w:r>
-      <w:r>
-        <w:rPr>
-          <w:rFonts w:hint="eastAsia"/>
-        </w:rPr>
-        <w:t>測試前的判斷</w:t>
-      </w:r>
-      <w:r>
-        <w:rPr>
-          <w:rFonts w:hint="eastAsia"/>
-        </w:rPr>
-        <w:t>)</w:t>
-      </w:r>
-      <w:r>
-        <w:rPr>
-          <w:rFonts w:hint="eastAsia"/>
-        </w:rPr>
-        <w:t>：</w:t>
-      </w:r>
-    </w:p>
-    <w:p>
-      <w:r>
-        <w:rPr>
-          <w:rFonts w:hint="eastAsia"/>
-        </w:rPr>
-        <w:t>第一個實驗</w:t>
-      </w:r>
-      <w:r>
-        <w:rPr>
-          <w:rFonts w:hint="eastAsia"/>
-        </w:rPr>
-        <w:t>為</w:t>
-      </w:r>
-      <w:r>
-        <w:t>系統可正常完成請求</w:t>
-      </w:r>
-      <w:r>
-        <w:t xml:space="preserve"> </w:t>
-      </w:r>
-      <w:r>
-        <w:rPr>
-          <w:rFonts w:hint="eastAsia"/>
-        </w:rPr>
-        <w:t>，</w:t>
-      </w:r>
-      <w:proofErr w:type="spellStart"/>
-      <w:r>
-        <w:t>hikaricp.connections.active</w:t>
-      </w:r>
-      <w:proofErr w:type="spellEnd"/>
-      <w:r>
-        <w:t xml:space="preserve"> </w:t>
-      </w:r>
-      <w:r>
-        <w:t>接近</w:t>
-      </w:r>
-      <w:r>
-        <w:t xml:space="preserve"> 10 </w:t>
-      </w:r>
-      <w:r>
-        <w:rPr>
-          <w:rFonts w:hint="eastAsia"/>
-        </w:rPr>
-        <w:t>，</w:t>
-      </w:r>
-      <w:proofErr w:type="spellStart"/>
-      <w:r>
-        <w:t>hikaricp.connections.pending</w:t>
-      </w:r>
-      <w:proofErr w:type="spellEnd"/>
-      <w:r>
-        <w:rPr>
-          <w:rFonts w:hint="eastAsia"/>
-        </w:rPr>
-        <w:t>，</w:t>
-      </w:r>
-      <w:r>
-        <w:t>可能出現少量等待</w:t>
-      </w:r>
-      <w:r>
-        <w:rPr>
-          <w:rFonts w:hint="eastAsia"/>
-        </w:rPr>
-        <w:t>，</w:t>
-      </w:r>
-      <w:r>
-        <w:t>作為後續實驗比較基準</w:t>
-      </w:r>
-    </w:p>
-    <w:p>
-      <w:r>
-        <w:t>實驗二</w:t>
-      </w:r>
-      <w:r>
-        <w:t xml:space="preserve"> DB Connection Pool </w:t>
-      </w:r>
-      <w:r>
-        <w:t>縮小</w:t>
-      </w:r>
-      <w:r>
-        <w:rPr>
-          <w:rFonts w:hint="eastAsia"/>
-        </w:rPr>
-        <w:t>，預期會</w:t>
-      </w:r>
-      <w:proofErr w:type="spellStart"/>
-      <w:r>
-        <w:t>hikaricp.connections.active</w:t>
-      </w:r>
-      <w:proofErr w:type="spellEnd"/>
-      <w:r>
-        <w:t xml:space="preserve"> </w:t>
-      </w:r>
-      <w:r>
-        <w:t>接近</w:t>
-      </w:r>
-      <w:r>
-        <w:t xml:space="preserve"> 3</w:t>
-      </w:r>
-      <w:r>
-        <w:rPr>
-          <w:rFonts w:hint="eastAsia"/>
-        </w:rPr>
-        <w:t>，</w:t>
-      </w:r>
-      <w:proofErr w:type="spellStart"/>
-      <w:r>
-        <w:t>hikaricp.connections.pending</w:t>
-      </w:r>
-      <w:proofErr w:type="spellEnd"/>
-      <w:r>
-        <w:t xml:space="preserve"> </w:t>
-      </w:r>
-      <w:r>
-        <w:t>明顯增加</w:t>
-      </w:r>
-      <w:r>
-        <w:rPr>
-          <w:rFonts w:hint="eastAsia"/>
-        </w:rPr>
-        <w:t>，</w:t>
-      </w:r>
-      <w:r>
-        <w:t xml:space="preserve">Throughput </w:t>
-      </w:r>
-      <w:r>
-        <w:t>下降或持平</w:t>
-      </w:r>
-      <w:r>
-        <w:rPr>
-          <w:rFonts w:hint="eastAsia"/>
-        </w:rPr>
-        <w:t>，</w:t>
-      </w:r>
-      <w:r>
-        <w:t xml:space="preserve">DB Connection Pool </w:t>
-      </w:r>
-      <w:r>
-        <w:t>成為主要瓶頸</w:t>
-      </w:r>
-      <w:r>
-        <w:rPr>
-          <w:rFonts w:hint="eastAsia"/>
-        </w:rPr>
-        <w:t>。</w:t>
-      </w:r>
-    </w:p>
-    <w:p>
-      <w:pPr>
-        <w:rPr>
-          <w:rFonts w:hint="eastAsia"/>
-        </w:rPr>
-      </w:pPr>
-      <w:r>
-        <w:t>實驗三</w:t>
-      </w:r>
-      <w:r>
-        <w:t xml:space="preserve"> Tomcat Thread Pool </w:t>
-      </w:r>
-      <w:r>
-        <w:t>調大更多</w:t>
-      </w:r>
-      <w:r>
-        <w:t xml:space="preserve"> request </w:t>
-      </w:r>
-      <w:r>
-        <w:t>可以同時進入</w:t>
-      </w:r>
-      <w:r>
-        <w:t xml:space="preserve"> applicatio</w:t>
-      </w:r>
-      <w:r>
-        <w:rPr>
-          <w:rFonts w:hint="eastAsia"/>
-        </w:rPr>
-        <w:t>n</w:t>
-      </w:r>
-      <w:r>
-        <w:rPr>
-          <w:rFonts w:hint="eastAsia"/>
-        </w:rPr>
-        <w:t>，</w:t>
-      </w:r>
-      <w:proofErr w:type="spellStart"/>
-      <w:r>
-        <w:t>hikaricp.connections.active</w:t>
-      </w:r>
-      <w:proofErr w:type="spellEnd"/>
-      <w:r>
-        <w:t xml:space="preserve"> </w:t>
-      </w:r>
-      <w:r>
-        <w:rPr>
-          <w:rFonts w:hint="eastAsia"/>
-        </w:rPr>
-        <w:t>會</w:t>
-      </w:r>
-      <w:r>
-        <w:t>接近</w:t>
-      </w:r>
-      <w:r>
-        <w:t xml:space="preserve"> 10</w:t>
-      </w:r>
-      <w:r>
-        <w:rPr>
-          <w:rFonts w:hint="eastAsia"/>
-        </w:rPr>
-        <w:t>，</w:t>
-      </w:r>
-      <w:proofErr w:type="spellStart"/>
-      <w:r>
-        <w:t>hikaricp.connections.pending</w:t>
-      </w:r>
-      <w:proofErr w:type="spellEnd"/>
-      <w:r>
-        <w:t xml:space="preserve"> </w:t>
-      </w:r>
-      <w:r>
-        <w:rPr>
-          <w:rFonts w:hint="eastAsia"/>
-        </w:rPr>
-        <w:t>增加到</w:t>
-      </w:r>
-      <w:r>
-        <w:rPr>
-          <w:rFonts w:hint="eastAsia"/>
-        </w:rPr>
-        <w:t>289</w:t>
-      </w:r>
-      <w:r>
-        <w:rPr>
-          <w:rFonts w:hint="eastAsia"/>
-        </w:rPr>
-        <w:t>，</w:t>
-      </w:r>
-      <w:r>
-        <w:rPr>
-          <w:rFonts w:hint="eastAsia"/>
-        </w:rPr>
-        <w:t>如果</w:t>
-      </w:r>
-      <w:r>
-        <w:t xml:space="preserve">DB Pool </w:t>
-      </w:r>
-      <w:r>
-        <w:t>不變，單純增加</w:t>
-      </w:r>
-      <w:r>
-        <w:t xml:space="preserve"> Tomcat Thread </w:t>
-      </w:r>
-      <w:r>
-        <w:t>無法突破資料庫瓶頸</w:t>
-      </w:r>
-      <w:r>
-        <w:rPr>
-          <w:rFonts w:hint="eastAsia"/>
-        </w:rPr>
-        <w:t>。</w:t>
-      </w:r>
-    </w:p>
-    <w:p>
-      <w:r>
-        <w:rPr>
-          <w:rFonts w:hint="eastAsia"/>
-        </w:rPr>
-        <w:t>結論</w:t>
-      </w:r>
-      <w:r>
-        <w:rPr>
-          <w:rFonts w:hint="eastAsia"/>
-        </w:rPr>
-        <w:t>：</w:t>
-      </w:r>
-    </w:p>
-    <w:p>
-      <w:r>
-        <w:rPr>
-          <w:rFonts w:hint="eastAsia"/>
-        </w:rPr>
-        <w:t>(</w:t>
-      </w:r>
-      <w:r>
-        <w:rPr>
-          <w:rFonts w:hint="eastAsia"/>
-        </w:rPr>
-        <w:t>在第二</w:t>
-      </w:r>
-      <w:proofErr w:type="gramStart"/>
-      <w:r>
-        <w:rPr>
-          <w:rFonts w:hint="eastAsia"/>
-        </w:rPr>
-        <w:t>個</w:t>
-      </w:r>
-      <w:proofErr w:type="gramEnd"/>
-      <w:r>
-        <w:t>DB connection pool</w:t>
-      </w:r>
-      <w:r>
-        <w:rPr>
-          <w:rFonts w:hint="eastAsia"/>
-        </w:rPr>
-        <w:t>縮小</w:t>
-      </w:r>
-      <w:r>
-        <w:rPr>
-          <w:rFonts w:hint="eastAsia"/>
-        </w:rPr>
-        <w:t>的實驗中，</w:t>
-      </w:r>
-      <w:r>
-        <w:t>active = 3</w:t>
-      </w:r>
-      <w:r>
-        <w:rPr>
-          <w:rFonts w:hint="eastAsia"/>
-        </w:rPr>
-        <w:t>，</w:t>
-      </w:r>
-      <w:r>
         <w:t>pending = 96</w:t>
       </w:r>
       <w:r>
@@ -763,25 +628,12 @@
       </w:r>
     </w:p>
     <w:p>
-      <w:pPr>
-        <w:rPr>
-          <w:rFonts w:hint="eastAsia"/>
-        </w:rPr>
-      </w:pPr>
-      <w:r>
-        <w:rPr>
-          <w:rFonts w:hint="eastAsia"/>
-        </w:rPr>
-        <w:t>在第三</w:t>
-      </w:r>
-      <w:proofErr w:type="gramStart"/>
-      <w:r>
-        <w:rPr>
-          <w:rFonts w:hint="eastAsia"/>
-        </w:rPr>
-        <w:t>個</w:t>
-      </w:r>
-      <w:proofErr w:type="gramEnd"/>
+      <w:r>
+        <w:rPr>
+          <w:rFonts w:hint="eastAsia"/>
+        </w:rPr>
+        <w:t>在第三個</w:t>
+      </w:r>
       <w:r>
         <w:t>Tomcat</w:t>
       </w:r>
@@ -2746,6 +2598,7 @@
   <w:style w:type="character" w:default="1" w:styleId="a0">
     <w:name w:val="Default Paragraph Font"/>
     <w:uiPriority w:val="1"/>
+    <w:semiHidden/>
     <w:unhideWhenUsed/>
   </w:style>
   <w:style w:type="table" w:default="1" w:styleId="a1">

</xml_diff>